<commit_message>
múltiples dataitems en un report
</commit_message>
<xml_diff>
--- a/source/BlockNonSatisfactoryItems.docx
+++ b/source/BlockNonSatisfactoryItems.docx
@@ -1487,12 +1487,24 @@
  
          < N o n S a t i s f a c t o r y P u r c h Q t y > N o n S a t i s f a c t o r y P u r c h Q t y < / N o n S a t i s f a c t o r y P u r c h Q t y >   
+         < I t e m Q u a l i t y C o n t r o l M e a s u r e s > + 
+             < M e a s u r e > M e a s u r e < / M e a s u r e > + 
+             < M e a s u r e _ D e s c r i p t i o n > M e a s u r e _ D e s c r i p t i o n < / M e a s u r e _ D e s c r i p t i o n > + 
+             < N o r m a l _ V a l u e > N o r m a l _ V a l u e < / N o r m a l _ V a l u e > + 
+         < / I t e m Q u a l i t y C o n t r o l M e a s u r e s > + 
      < / I t e m >   
  < / N a v W o r d R e p o r t X m l P a r t > 
 </file>
 
-<file path=customXml/item2.xml>��< ? x m l   v e r s i o n = " 1 . 0 "   e n c o d i n g = " u t f - 1 6 " ? > < N a v W o r d R e p o r t X m l P a r t   x m l n s = " u r n : m i c r o s o f t - d y n a m i c s - b u s i n e s s c e n t r a l / i n t e r n a l / e x t e n d e d / r e p o r t s / B l o c k _ N o n _ S a t i s f a c t o r y _ I t e m s / 5 0 1 0 0 / " > +<file path=customXml/item2.xml>��< ? x m l   v e r s i o n = " 1 . 0 "   e n c o d i n g = " u t f - 1 6 " ? > + 
+ < N a v W o r d R e p o r t X m l P a r t   x m l n s = " u r n : m i c r o s o f t - d y n a m i c s - b u s i n e s s c e n t r a l / i n t e r n a l / e x t e n d e d / r e p o r t s / B l o c k _ N o n _ S a t i s f a c t o r y _ I t e m s / 5 0 1 0 0 / " >   
      < B C R e p o r t I n f o r m a t i o n >   
@@ -1568,7 +1580,21 @@
  
      < / L a b e l s >   
-     < T o o l t i p s / > +     < T o o l t i p s > + 
+         < T o o l t i p   c o l u m n = " M e a s u r e "   E l e m e n t I d = " 3 3 6 6 5 7 9 3 1 " > + 
+             < T o o l t i p T e x t   l a n g = " e n - U S " > s a n v a s j h < / T o o l t i p T e x t > + 
+         < / T o o l t i p > + 
+         < T o o l t i p   c o l u m n = " N o r m a l _ V a l u e "   E l e m e n t I d = " 1 7 7 8 6 1 8 5 8 2 " > + 
+             < T o o l t i p T e x t   l a n g = " e n - U S " > s a n v a s j h < / T o o l t i p T e x t > + 
+         < / T o o l t i p > + 
+     < / T o o l t i p s >   
      < I t e m   E l e m e n t T y p e = " D a t a I t e m "   E l e m e n t I d = " 1 1 2 8 8 3 0 2 4 8 " >   
@@ -1581,6 +1607,16 @@
          < N o   E l e m e n t T y p e = " C o l u m n "   E l e m e n t I d = " 1 1 9 8 2 6 8 3 4 0 "   D a t a T y p e = " C o d e " > N o < / N o >   
          < N o n S a t i s f a c t o r y P u r c h Q t y   E l e m e n t T y p e = " C o l u m n "   E l e m e n t I d = " 6 6 2 6 9 1 1 8 6 "   D a t a T y p e = " D e c i m a l " > N o n S a t i s f a c t o r y P u r c h Q t y < / N o n S a t i s f a c t o r y P u r c h Q t y > + 
+         < I t e m Q u a l i t y C o n t r o l M e a s u r e s   E l e m e n t T y p e = " D a t a I t e m "   E l e m e n t I d = " 1 1 0 1 3 5 7 7 6 1 " > + 
+             < M e a s u r e   E l e m e n t T y p e = " C o l u m n "   E l e m e n t I d = " 3 3 6 6 5 7 9 3 1 "   D a t a T y p e = " C o d e " > M e a s u r e < / M e a s u r e > + 
+             < M e a s u r e _ D e s c r i p t i o n   E l e m e n t T y p e = " C o l u m n "   E l e m e n t I d = " 8 8 8 7 4 8 5 4 8 "   D a t a T y p e = " T e x t " > M e a s u r e _ D e s c r i p t i o n < / M e a s u r e _ D e s c r i p t i o n > + 
+             < N o r m a l _ V a l u e   E l e m e n t T y p e = " C o l u m n "   E l e m e n t I d = " 1 7 7 8 6 1 8 5 8 2 "   D a t a T y p e = " T e x t " > N o r m a l _ V a l u e < / N o r m a l _ V a l u e > + 
+         < / I t e m Q u a l i t y C o n t r o l M e a s u r e s >   
      < / I t e m >   

</xml_diff>